<commit_message>
Fix CFG reachability and update Review 3 evidence
</commit_message>
<xml_diff>
--- a/docs/review3/RANGE_LAB_Screenshot_Catalog.docx
+++ b/docs/review3/RANGE_LAB_Screenshot_Catalog.docx
@@ -393,7 +393,7 @@
               <w:rPr>
                 <w:sz w:val="17"/>
               </w:rPr>
-              <w:t>RANGE//LAB Integrated Workbench Desktop Interface</w:t>
+              <w:t>RANGE//LAB Integrated Workbench Desktop Interface (Range Analysis View)</w:t>
             </w:r>
           </w:p>
         </w:tc>
@@ -409,7 +409,7 @@
               <w:rPr>
                 <w:sz w:val="17"/>
               </w:rPr>
-              <w:t>Full Application / Stage Navigator</w:t>
+              <w:t>Range Analysis Stage (RangesView) &amp; Stage Navigator</w:t>
             </w:r>
           </w:p>
         </w:tc>
@@ -441,7 +441,7 @@
               <w:rPr>
                 <w:sz w:val="17"/>
               </w:rPr>
-              <w:t>2244 × 1209</w:t>
+              <w:t>2244 × 1239</w:t>
             </w:r>
           </w:p>
         </w:tc>
@@ -861,7 +861,7 @@
               <w:rPr>
                 <w:sz w:val="17"/>
               </w:rPr>
-              <w:t>2244 × 1209</w:t>
+              <w:t>2241 × 1199</w:t>
             </w:r>
           </w:p>
         </w:tc>
@@ -1501,7 +1501,7 @@
               <w:rPr>
                 <w:sz w:val="17"/>
               </w:rPr>
-              <w:t>Dual-Terminal Verification Console (verification.html)</w:t>
+              <w:t>Dual-Terminal Verification Console (Programmatically Rendered Terminal Summary)</w:t>
             </w:r>
           </w:p>
         </w:tc>
@@ -1559,7 +1559,7 @@
         <w:spacing w:before="240" w:after="80"/>
       </w:pPr>
       <w:r>
-        <w:t>Figure 1: RANGE//LAB Integrated Workbench Desktop Interface</w:t>
+        <w:t>Figure 1: RANGE//LAB Integrated Workbench Desktop Interface (Range Analysis View)</w:t>
       </w:r>
     </w:p>
     <w:p>
@@ -1570,7 +1570,7 @@
       <w:r>
         <w:drawing>
           <wp:inline xmlns:a="http://schemas.openxmlformats.org/drawingml/2006/main" xmlns:pic="http://schemas.openxmlformats.org/drawingml/2006/picture">
-            <wp:extent cx="6035040" cy="3251499"/>
+            <wp:extent cx="6035040" cy="3332181"/>
             <wp:docPr id="1" name="Picture 1"/>
             <wp:cNvGraphicFramePr>
               <a:graphicFrameLocks noChangeAspect="1"/>
@@ -1591,7 +1591,7 @@
                   <pic:spPr>
                     <a:xfrm>
                       <a:off x="0" y="0"/>
-                      <a:ext cx="6035040" cy="3251499"/>
+                      <a:ext cx="6035040" cy="3332181"/>
                     </a:xfrm>
                     <a:prstGeom prst="rect"/>
                   </pic:spPr>
@@ -1614,7 +1614,7 @@
           <w:color w:val="283246"/>
           <w:sz w:val="19"/>
         </w:rPr>
-        <w:t>Figure 1: RANGE//LAB Integrated Workbench Desktop Interface — safe_arithmetic.qc (Provably Safe Arithmetic)</w:t>
+        <w:t>Figure 1: RANGE//LAB Integrated Workbench Desktop Interface (Range Analysis View) — safe_arithmetic.qc (Provably Safe Arithmetic)</w:t>
       </w:r>
     </w:p>
     <w:tbl>
@@ -1658,7 +1658,7 @@
               <w:rPr>
                 <w:sz w:val="17"/>
               </w:rPr>
-              <w:t>01-main-workbench.png — 2244 × 1209 px (Rendered High-DPI; 1496 × 857 pt CSS Viewport)</w:t>
+              <w:t>01-main-workbench.png — 2244 × 1239 px (Rendered High-DPI; 1496 × 826 pt CSS Viewport)</w:t>
             </w:r>
           </w:p>
         </w:tc>
@@ -1694,7 +1694,7 @@
               <w:rPr>
                 <w:sz w:val="17"/>
               </w:rPr>
-              <w:t>Full Application / Stage Navigator</w:t>
+              <w:t>Range Analysis Stage (RangesView) &amp; Stage Navigator</w:t>
             </w:r>
           </w:p>
         </w:tc>
@@ -1787,7 +1787,7 @@
         <w:rPr>
           <w:sz w:val="18"/>
         </w:rPr>
-        <w:t>Complete desktop view of the RANGE//LAB interactive compiler workbench. Demonstrates the live Monaco editor on the left (with numerical C-like source code, line numbers, and syntax highlighting), compiler control switches (widen_after threshold input, --narrow iteration toggle, --prune unreachable toggle), the multi-stage pipeline navigation bar across the top with stage status badges, and the active results panel showing compilation metrics.</w:t>
+        <w:t>Complete desktop view of the RANGE//LAB interactive compiler workbench. Demonstrates the live Monaco editor on the left (with numerical C-like source code for safe_arithmetic.qc, line numbers, and syntax highlighting), compiler control switches (widen_after threshold input, --narrow iteration toggle, --prune unreachable toggle), the multi-stage pipeline navigation bar across the top with stage status badges, and the active results panel displaying the Range Analysis stage with inferred interval table, integrality flags, and convergence status.</w:t>
       </w:r>
     </w:p>
     <w:p>
@@ -2970,7 +2970,7 @@
       <w:r>
         <w:drawing>
           <wp:inline xmlns:a="http://schemas.openxmlformats.org/drawingml/2006/main" xmlns:pic="http://schemas.openxmlformats.org/drawingml/2006/picture">
-            <wp:extent cx="6035040" cy="3251499"/>
+            <wp:extent cx="6035040" cy="3228921"/>
             <wp:docPr id="6" name="Picture 6"/>
             <wp:cNvGraphicFramePr>
               <a:graphicFrameLocks noChangeAspect="1"/>
@@ -2991,7 +2991,7 @@
                   <pic:spPr>
                     <a:xfrm>
                       <a:off x="0" y="0"/>
-                      <a:ext cx="6035040" cy="3251499"/>
+                      <a:ext cx="6035040" cy="3228921"/>
                     </a:xfrm>
                     <a:prstGeom prst="rect"/>
                   </pic:spPr>
@@ -3058,7 +3058,7 @@
               <w:rPr>
                 <w:sz w:val="17"/>
               </w:rPr>
-              <w:t>06-control-flow-graph.png — 2244 × 1209 px (Rendered High-DPI; 1496 × 857 pt CSS Viewport)</w:t>
+              <w:t>06-control-flow-graph.png — 2241 × 1199 px (Rendered High-DPI; 1494 × 799 pt CSS Viewport)</w:t>
             </w:r>
           </w:p>
         </w:tc>
@@ -3187,7 +3187,7 @@
         <w:rPr>
           <w:sz w:val="18"/>
         </w:rPr>
-        <w:t>Interactive React Flow graph visualization for if_else_phi.qc. Depicts discrete basic blocks (entry block B0, True branch B1, False branch B2, and join block B3) connected by directed control-flow edges labeled with conditional branch predicates (True/False) and unconditional jumps. Instructions are cleanly formatted within each block.</w:t>
+        <w:t>Interactive React Flow graph visualization for if_else_phi.qc with branch-refinement annotations. Depicts discrete basic blocks (entry block B0, condition block B1, unreachable true branch B3 labeled UNREACHABLE, reachable false branch B4, and reachable join block B5) connected by directed control-flow edges labeled with conditional branch predicates and unconditional jumps. Reflects sound static analysis: since x=10 and y=20, condition x &gt; y is statically false, making true branch B3 unreachable while join block B5 remains reachable via false branch B4.</w:t>
       </w:r>
     </w:p>
     <w:p>
@@ -3205,7 +3205,7 @@
         <w:rPr>
           <w:sz w:val="18"/>
         </w:rPr>
-        <w:t>Confirms correct basic block partitioning, leader identification, control-flow edge construction, and graph rendering from Three-Address Code.</w:t>
+        <w:t>Confirms correct basic block partitioning, leader identification, control-flow edge construction, path-sensitive reachability labeling, and graph rendering from Three-Address Code.</w:t>
       </w:r>
     </w:p>
     <w:p>
@@ -5254,7 +5254,7 @@
           <w:color w:val="283246"/>
           <w:sz w:val="19"/>
         </w:rPr>
-        <w:t>Figure 14: Automated Unit Test Suite and Reproducible Evaluation Terminal — Test Suite (137 tests) &amp; Reproducible Evaluation (12 benchmarks)</w:t>
+        <w:t>Figure 14: Automated Unit Test Suite and Reproducible Evaluation Terminal — Test Suite (138 tests) &amp; Reproducible Evaluation (12 benchmarks)</w:t>
       </w:r>
     </w:p>
     <w:tbl>
@@ -5334,7 +5334,7 @@
               <w:rPr>
                 <w:sz w:val="17"/>
               </w:rPr>
-              <w:t>Dual-Terminal Verification Console (verification.html)</w:t>
+              <w:t>Dual-Terminal Verification Console (Programmatically Rendered Terminal Summary)</w:t>
             </w:r>
           </w:p>
         </w:tc>
@@ -5370,7 +5370,7 @@
               <w:rPr>
                 <w:sz w:val="17"/>
               </w:rPr>
-              <w:t>Test Suite (137 tests) &amp; Reproducible Evaluation (12 benchmarks)</w:t>
+              <w:t>Test Suite (138 tests) &amp; Reproducible Evaluation (12 benchmarks)</w:t>
             </w:r>
           </w:p>
         </w:tc>
@@ -5427,7 +5427,7 @@
         <w:rPr>
           <w:sz w:val="18"/>
         </w:rPr>
-        <w:t>High-resolution terminal verification display captured from the live application environment. Left window shows the Python unittest runner completing all 137 unit tests with zero errors and zero failures (OK in 0.511s on capture, 0.291s in current run). Right window shows the reproducible evaluation suite (evaluate.py / tests.evaluation) executing all 12 benchmarks with 54 SSA variables, 35 safe (64.8%), 32 quantized (59.3%), 3 blocked, 19 rejected (35.2%), no safety violations observed across the 12 evaluated benchmarks, 100% simulation equivalence rate, 44.4% theoretical storage-width reduction, and ALL PASS status.</w:t>
+        <w:t>Programmatically rendered verification terminal summary (composite report of actual executed command outputs). Left window shows the Python unittest runner completing all 138 unit tests with zero errors and zero failures (OK in ~0.35s). Right window shows the reproducible evaluation suite (evaluate.py / tests.evaluation) executing all 12 benchmarks with 54 SSA variables, 35 safe (64.8%), 32 quantized (59.3%), 3 blocked (5.6%), 19 rejected (35.2%), no safety violations observed across the 12 evaluated benchmarks, 100% simulation equivalence rate, 44.4% theoretical storage-width reduction, and ALL PASS status.</w:t>
       </w:r>
     </w:p>
     <w:p>
@@ -5445,7 +5445,7 @@
         <w:rPr>
           <w:sz w:val="18"/>
         </w:rPr>
-        <w:t>Provides authentic, unedited empirical evidence of comprehensive compiler test coverage (137 unit tests) and reproducible benchmark validation with 100% equivalence and no observed safety violations across the evaluation benchmarks.</w:t>
+        <w:t>Provides a clear, verified summary composite of comprehensive compiler test coverage (138 unit tests) and reproducible benchmark validation with 100% equivalence and no observed safety violations across the evaluation benchmarks. Raw execution stdout/stderr is preserved as separate textual evidence.</w:t>
       </w:r>
     </w:p>
     <w:p>
@@ -5465,7 +5465,7 @@
           <w:i/>
           <w:sz w:val="18"/>
         </w:rPr>
-        <w:t>Confirms software correctness across the 137 test cases and 12 benchmarks; theoretical storage reduction (44.4%) is an estimate of representation width, not measured hardware speedup.</w:t>
+        <w:t>Programmatically rendered summary composite of actual command output rather than a direct window screenshot; confirms software correctness across the 138 test cases and 12 benchmarks; theoretical storage reduction (44.4%) is an estimate of static representation width, not measured hardware speedup.</w:t>
       </w:r>
     </w:p>
     <w:p>

</xml_diff>